<commit_message>
Preserve markdown spacing in docx
</commit_message>
<xml_diff>
--- a/README.docx
+++ b/README.docx
@@ -5,6 +5,7 @@
     <w:p>
       <w:pPr>
         <w:pStyle w:val="Title"/>
+        <w:spacing w:after="240"/>
       </w:pPr>
       <w:r>
         <w:t xml:space="preserve">instruct</w:t>
@@ -13,6 +14,7 @@
     <w:p>
       <w:pPr>
         <w:pStyle w:val="Normal"/>
+        <w:spacing w:after="240"/>
       </w:pPr>
       <w:r>
         <w:rPr>
@@ -29,6 +31,7 @@
     <w:p>
       <w:pPr>
         <w:pStyle w:val="Heading2"/>
+        <w:spacing w:after="240"/>
       </w:pPr>
       <w:r>
         <w:t xml:space="preserve">Status</w:t>
@@ -37,6 +40,7 @@
     <w:p>
       <w:pPr>
         <w:pStyle w:val="Normal"/>
+        <w:spacing w:after="240"/>
       </w:pPr>
       <w:r>
         <w:t xml:space="preserve">MVP scaffold implemented for </w:t>
@@ -112,6 +116,7 @@
     <w:p>
       <w:pPr>
         <w:pStyle w:val="Heading2"/>
+        <w:spacing w:after="240"/>
       </w:pPr>
       <w:r>
         <w:t xml:space="preserve">Quick start</w:t>
@@ -155,6 +160,7 @@
     <w:p>
       <w:pPr>
         <w:pStyle w:val="Normal"/>
+        <w:spacing w:after="240"/>
       </w:pPr>
       <w:r>
         <w:t xml:space="preserve">Guided mode:</w:t>
@@ -206,6 +212,7 @@
     <w:p>
       <w:pPr>
         <w:pStyle w:val="Heading2"/>
+        <w:spacing w:after="240"/>
       </w:pPr>
       <w:r>
         <w:t xml:space="preserve">Commands</w:t>
@@ -249,6 +256,7 @@
     <w:p>
       <w:pPr>
         <w:pStyle w:val="Normal"/>
+        <w:spacing w:after="240"/>
       </w:pPr>
       <w:r>
         <w:t xml:space="preserve">Batch mode:</w:t>
@@ -281,6 +289,7 @@
     <w:p>
       <w:pPr>
         <w:pStyle w:val="Normal"/>
+        <w:spacing w:after="240"/>
       </w:pPr>
       <w:r>
         <w:t xml:space="preserve">Run command-specific help for full examples:</w:t>
@@ -324,6 +333,7 @@
     <w:p>
       <w:pPr>
         <w:pStyle w:val="Heading2"/>
+        <w:spacing w:after="240"/>
       </w:pPr>
       <w:r>
         <w:t xml:space="preserve">Docs</w:t>
@@ -444,6 +454,7 @@
     <w:p>
       <w:pPr>
         <w:pStyle w:val="Heading2"/>
+        <w:spacing w:after="240"/>
       </w:pPr>
       <w:r>
         <w:t xml:space="preserve">Warning Codes</w:t>
@@ -452,6 +463,7 @@
     <w:p>
       <w:pPr>
         <w:pStyle w:val="Normal"/>
+        <w:spacing w:after="240"/>
       </w:pPr>
       <w:r>
         <w:t xml:space="preserve">See </w:t>
@@ -471,6 +483,7 @@
     <w:p>
       <w:pPr>
         <w:pStyle w:val="Heading2"/>
+        <w:spacing w:after="240"/>
       </w:pPr>
       <w:r>
         <w:t xml:space="preserve">License</w:t>
@@ -479,6 +492,7 @@
     <w:p>
       <w:pPr>
         <w:pStyle w:val="Normal"/>
+        <w:spacing w:after="240"/>
       </w:pPr>
       <w:r>
         <w:t xml:space="preserve">Apache-2.0</w:t>

</xml_diff>

<commit_message>
Test docx to markdown fidelity
</commit_message>
<xml_diff>
--- a/README.docx
+++ b/README.docx
@@ -31,7 +31,7 @@
     <w:p>
       <w:pPr>
         <w:pStyle w:val="Heading2"/>
-        <w:spacing w:after="240"/>
+        <w:spacing w:before="240" w:after="240"/>
       </w:pPr>
       <w:r>
         <w:t xml:space="preserve">Status</w:t>
@@ -116,7 +116,7 @@
     <w:p>
       <w:pPr>
         <w:pStyle w:val="Heading2"/>
-        <w:spacing w:after="240"/>
+        <w:spacing w:before="240" w:after="240"/>
       </w:pPr>
       <w:r>
         <w:t xml:space="preserve">Quick start</w:t>
@@ -212,7 +212,7 @@
     <w:p>
       <w:pPr>
         <w:pStyle w:val="Heading2"/>
-        <w:spacing w:after="240"/>
+        <w:spacing w:before="240" w:after="240"/>
       </w:pPr>
       <w:r>
         <w:t xml:space="preserve">Commands</w:t>
@@ -333,7 +333,7 @@
     <w:p>
       <w:pPr>
         <w:pStyle w:val="Heading2"/>
-        <w:spacing w:after="240"/>
+        <w:spacing w:before="240" w:after="240"/>
       </w:pPr>
       <w:r>
         <w:t xml:space="preserve">Docs</w:t>
@@ -454,7 +454,7 @@
     <w:p>
       <w:pPr>
         <w:pStyle w:val="Heading2"/>
-        <w:spacing w:after="240"/>
+        <w:spacing w:before="240" w:after="240"/>
       </w:pPr>
       <w:r>
         <w:t xml:space="preserve">Warning Codes</w:t>
@@ -483,7 +483,7 @@
     <w:p>
       <w:pPr>
         <w:pStyle w:val="Heading2"/>
-        <w:spacing w:after="240"/>
+        <w:spacing w:before="240" w:after="240"/>
       </w:pPr>
       <w:r>
         <w:t xml:space="preserve">License</w:t>

</xml_diff>

<commit_message>
Verify docwarp rename references
</commit_message>
<xml_diff>
--- a/README.docx
+++ b/README.docx
@@ -4,11 +4,11 @@
   <w:body>
     <w:p>
       <w:pPr>
-        <w:pStyle w:val="Title"/>
-        <w:spacing w:after="240"/>
-      </w:pPr>
-      <w:r>
-        <w:t xml:space="preserve">instruct</w:t>
+        <w:pStyle w:val="Heading1"/>
+        <w:spacing w:after="240"/>
+      </w:pPr>
+      <w:r>
+        <w:t xml:space="preserve">docwarp</w:t>
       </w:r>
     </w:p>
     <w:p>
@@ -22,7 +22,7 @@
           <w:rFonts w:ascii="Consolas" w:hAnsi="Consolas"/>
           <w:sz w:val="20"/>
         </w:rPr>
-        <w:t xml:space="preserve">instruct</w:t>
+        <w:t xml:space="preserve">docwarp</w:t>
       </w:r>
       <w:r>
         <w:t xml:space="preserve"> is a lightweight open-source CLI for converting documents between GitHub-Flavored Markdown and Microsoft Word-compatible DOCX.</w:t>
@@ -60,14 +60,15 @@
     <w:p>
       <w:pPr>
         <w:pStyle w:val="ListBullet"/>
-      </w:pPr>
-      <w:r>
-        <w:rPr>
-          <w:rStyle w:val="Code"/>
-          <w:rFonts w:ascii="Consolas" w:hAnsi="Consolas"/>
-          <w:sz w:val="20"/>
-        </w:rPr>
-        <w:t xml:space="preserve">instruct md2docx</w:t>
+        <w:ind w:left="720" w:hanging="360"/>
+      </w:pPr>
+      <w:r>
+        <w:rPr>
+          <w:rStyle w:val="Code"/>
+          <w:rFonts w:ascii="Consolas" w:hAnsi="Consolas"/>
+          <w:sz w:val="20"/>
+        </w:rPr>
+        <w:t xml:space="preserve">docwarp md2docx</w:t>
       </w:r>
       <w:r>
         <w:t xml:space="preserve"> for Markdown -&gt; DOCX</w:t>
@@ -76,14 +77,15 @@
     <w:p>
       <w:pPr>
         <w:pStyle w:val="ListBullet"/>
-      </w:pPr>
-      <w:r>
-        <w:rPr>
-          <w:rStyle w:val="Code"/>
-          <w:rFonts w:ascii="Consolas" w:hAnsi="Consolas"/>
-          <w:sz w:val="20"/>
-        </w:rPr>
-        <w:t xml:space="preserve">instruct docx2md</w:t>
+        <w:ind w:left="720" w:hanging="360"/>
+      </w:pPr>
+      <w:r>
+        <w:rPr>
+          <w:rStyle w:val="Code"/>
+          <w:rFonts w:ascii="Consolas" w:hAnsi="Consolas"/>
+          <w:sz w:val="20"/>
+        </w:rPr>
+        <w:t xml:space="preserve">docwarp docx2md</w:t>
       </w:r>
       <w:r>
         <w:t xml:space="preserve"> for DOCX -&gt; Markdown</w:t>
@@ -92,6 +94,7 @@
     <w:p>
       <w:pPr>
         <w:pStyle w:val="ListBullet"/>
+        <w:ind w:left="720" w:hanging="360"/>
       </w:pPr>
       <w:r>
         <w:t xml:space="preserve">warning-first conversion policy with optional strict mode</w:t>
@@ -100,6 +103,7 @@
     <w:p>
       <w:pPr>
         <w:pStyle w:val="ListBullet"/>
+        <w:ind w:left="720" w:hanging="360"/>
       </w:pPr>
       <w:r>
         <w:t xml:space="preserve">optional JSON report output</w:t>
@@ -108,6 +112,7 @@
     <w:p>
       <w:pPr>
         <w:pStyle w:val="ListBullet"/>
+        <w:ind w:left="720" w:hanging="360"/>
       </w:pPr>
       <w:r>
         <w:t xml:space="preserve">style-map + config support</w:t>
@@ -128,11 +133,17 @@
       </w:pPr>
       <w:r>
         <w:rPr>
-          <w:rStyle w:val="Code"/>
-          <w:rFonts w:ascii="Consolas" w:hAnsi="Consolas"/>
-          <w:sz w:val="20"/>
-        </w:rPr>
-        <w:t xml:space="preserve">instruct</w:t>
+          <w:vanish/>
+        </w:rPr>
+        <w:t xml:space="preserve">[[docwarp-code-lang:bash]]</w:t>
+      </w:r>
+      <w:r>
+        <w:rPr>
+          <w:rStyle w:val="Code"/>
+          <w:rFonts w:ascii="Consolas" w:hAnsi="Consolas"/>
+          <w:sz w:val="20"/>
+        </w:rPr>
+        <w:t xml:space="preserve">docwarp</w:t>
       </w:r>
       <w:r>
         <w:br/>
@@ -143,7 +154,7 @@
           <w:rFonts w:ascii="Consolas" w:hAnsi="Consolas"/>
           <w:sz w:val="20"/>
         </w:rPr>
-        <w:t xml:space="preserve">cargo run -p instruct-cli -- md2docx input.md --output output.docx</w:t>
+        <w:t xml:space="preserve">cargo run -p docwarp-cli -- md2docx input.md --output output.docx</w:t>
       </w:r>
       <w:r>
         <w:br/>
@@ -154,7 +165,7 @@
           <w:rFonts w:ascii="Consolas" w:hAnsi="Consolas"/>
           <w:sz w:val="20"/>
         </w:rPr>
-        <w:t xml:space="preserve">cargo run -p instruct-cli -- docx2md input.docx --output output.md</w:t>
+        <w:t xml:space="preserve">cargo run -p docwarp-cli -- docx2md input.docx --output output.md</w:t>
       </w:r>
     </w:p>
     <w:p>
@@ -169,6 +180,7 @@
     <w:p>
       <w:pPr>
         <w:pStyle w:val="ListBullet"/>
+        <w:ind w:left="720" w:hanging="360"/>
       </w:pPr>
       <w:r>
         <w:t xml:space="preserve">Run </w:t>
@@ -179,7 +191,7 @@
           <w:rFonts w:ascii="Consolas" w:hAnsi="Consolas"/>
           <w:sz w:val="20"/>
         </w:rPr>
-        <w:t xml:space="preserve">instruct</w:t>
+        <w:t xml:space="preserve">docwarp</w:t>
       </w:r>
       <w:r>
         <w:t xml:space="preserve"> with no arguments.</w:t>
@@ -188,6 +200,7 @@
     <w:p>
       <w:pPr>
         <w:pStyle w:val="ListBullet"/>
+        <w:ind w:left="720" w:hanging="360"/>
       </w:pPr>
       <w:r>
         <w:t xml:space="preserve">Drag a file/folder path into the terminal (or browse interactively).</w:t>
@@ -196,14 +209,15 @@
     <w:p>
       <w:pPr>
         <w:pStyle w:val="ListBullet"/>
-      </w:pPr>
-      <w:r>
-        <w:rPr>
-          <w:rStyle w:val="Code"/>
-          <w:rFonts w:ascii="Consolas" w:hAnsi="Consolas"/>
-          <w:sz w:val="20"/>
-        </w:rPr>
-        <w:t xml:space="preserve">instruct</w:t>
+        <w:ind w:left="720" w:hanging="360"/>
+      </w:pPr>
+      <w:r>
+        <w:rPr>
+          <w:rStyle w:val="Code"/>
+          <w:rFonts w:ascii="Consolas" w:hAnsi="Consolas"/>
+          <w:sz w:val="20"/>
+        </w:rPr>
+        <w:t xml:space="preserve">docwarp</w:t>
       </w:r>
       <w:r>
         <w:t xml:space="preserve"> detects Markdown vs DOCX and runs the matching conversion automatically.</w:t>
@@ -224,11 +238,17 @@
       </w:pPr>
       <w:r>
         <w:rPr>
-          <w:rStyle w:val="Code"/>
-          <w:rFonts w:ascii="Consolas" w:hAnsi="Consolas"/>
-          <w:sz w:val="20"/>
-        </w:rPr>
-        <w:t xml:space="preserve">instruct</w:t>
+          <w:vanish/>
+        </w:rPr>
+        <w:t xml:space="preserve">[[docwarp-code-lang:text]]</w:t>
+      </w:r>
+      <w:r>
+        <w:rPr>
+          <w:rStyle w:val="Code"/>
+          <w:rFonts w:ascii="Consolas" w:hAnsi="Consolas"/>
+          <w:sz w:val="20"/>
+        </w:rPr>
+        <w:t xml:space="preserve">docwarp</w:t>
       </w:r>
       <w:r>
         <w:br/>
@@ -239,7 +259,7 @@
           <w:rFonts w:ascii="Consolas" w:hAnsi="Consolas"/>
           <w:sz w:val="20"/>
         </w:rPr>
-        <w:t xml:space="preserve">instruct md2docx &lt;input.md|input_dir&gt; --output &lt;output.docx|output_dir&gt; [--glob &lt;pattern&gt;] [--template &lt;template.dotx&gt;] [--style-map &lt;map.yml&gt;] [--config &lt;instruct.yml&gt;] [--report &lt;report.json|report_dir&gt;] [--strict] [--allow-remote-images]</w:t>
+        <w:t xml:space="preserve">docwarp md2docx &lt;input.md|input_dir&gt; --output &lt;output.docx|output_dir&gt; [--glob &lt;pattern&gt;] [--template &lt;template.dotx&gt;] [--style-map &lt;map.yml&gt;] [--config &lt;docwarp.yml&gt;] [--report &lt;report.json|report_dir&gt;] [--strict] [--allow-remote-images]</w:t>
       </w:r>
       <w:r>
         <w:br/>
@@ -250,7 +270,7 @@
           <w:rFonts w:ascii="Consolas" w:hAnsi="Consolas"/>
           <w:sz w:val="20"/>
         </w:rPr>
-        <w:t xml:space="preserve">instruct docx2md &lt;input.docx|input_dir&gt; --output &lt;output.md|output_dir&gt; [--glob &lt;pattern&gt;] [--assets-dir &lt;dir&gt;] [--style-map &lt;map.yml&gt;] [--config &lt;instruct.yml&gt;] [--report &lt;report.json|report_dir&gt;] [--strict]</w:t>
+        <w:t xml:space="preserve">docwarp docx2md &lt;input.docx|input_dir&gt; --output &lt;output.md|output_dir&gt; [--glob &lt;pattern&gt;] [--assets-dir &lt;dir&gt;] [--style-map &lt;map.yml&gt;] [--config &lt;docwarp.yml&gt;] [--report &lt;report.json|report_dir&gt;] [--strict]</w:t>
       </w:r>
     </w:p>
     <w:p>
@@ -268,11 +288,17 @@
       </w:pPr>
       <w:r>
         <w:rPr>
-          <w:rStyle w:val="Code"/>
-          <w:rFonts w:ascii="Consolas" w:hAnsi="Consolas"/>
-          <w:sz w:val="20"/>
-        </w:rPr>
-        <w:t xml:space="preserve">instruct md2docx ./docs --output ./build/docx</w:t>
+          <w:vanish/>
+        </w:rPr>
+        <w:t xml:space="preserve">[[docwarp-code-lang:bash]]</w:t>
+      </w:r>
+      <w:r>
+        <w:rPr>
+          <w:rStyle w:val="Code"/>
+          <w:rFonts w:ascii="Consolas" w:hAnsi="Consolas"/>
+          <w:sz w:val="20"/>
+        </w:rPr>
+        <w:t xml:space="preserve">docwarp md2docx ./docs --output ./build/docx</w:t>
       </w:r>
       <w:r>
         <w:br/>
@@ -283,7 +309,7 @@
           <w:rFonts w:ascii="Consolas" w:hAnsi="Consolas"/>
           <w:sz w:val="20"/>
         </w:rPr>
-        <w:t xml:space="preserve">instruct docx2md ./contracts --output ./build/md --glob "**/*.docx"</w:t>
+        <w:t xml:space="preserve">docwarp docx2md ./contracts --output ./build/md --glob "**/*.docx"</w:t>
       </w:r>
     </w:p>
     <w:p>
@@ -301,11 +327,17 @@
       </w:pPr>
       <w:r>
         <w:rPr>
-          <w:rStyle w:val="Code"/>
-          <w:rFonts w:ascii="Consolas" w:hAnsi="Consolas"/>
-          <w:sz w:val="20"/>
-        </w:rPr>
-        <w:t xml:space="preserve">instruct --help</w:t>
+          <w:vanish/>
+        </w:rPr>
+        <w:t xml:space="preserve">[[docwarp-code-lang:bash]]</w:t>
+      </w:r>
+      <w:r>
+        <w:rPr>
+          <w:rStyle w:val="Code"/>
+          <w:rFonts w:ascii="Consolas" w:hAnsi="Consolas"/>
+          <w:sz w:val="20"/>
+        </w:rPr>
+        <w:t xml:space="preserve">docwarp --help</w:t>
       </w:r>
       <w:r>
         <w:br/>
@@ -316,7 +348,7 @@
           <w:rFonts w:ascii="Consolas" w:hAnsi="Consolas"/>
           <w:sz w:val="20"/>
         </w:rPr>
-        <w:t xml:space="preserve">instruct md2docx --help</w:t>
+        <w:t xml:space="preserve">docwarp md2docx --help</w:t>
       </w:r>
       <w:r>
         <w:br/>
@@ -327,7 +359,7 @@
           <w:rFonts w:ascii="Consolas" w:hAnsi="Consolas"/>
           <w:sz w:val="20"/>
         </w:rPr>
-        <w:t xml:space="preserve">instruct docx2md --help</w:t>
+        <w:t xml:space="preserve">docwarp docx2md --help</w:t>
       </w:r>
     </w:p>
     <w:p>
@@ -342,6 +374,7 @@
     <w:p>
       <w:pPr>
         <w:pStyle w:val="ListBullet"/>
+        <w:ind w:left="720" w:hanging="360"/>
       </w:pPr>
       <w:r>
         <w:t xml:space="preserve">Install guide: </w:t>
@@ -358,6 +391,7 @@
     <w:p>
       <w:pPr>
         <w:pStyle w:val="ListBullet"/>
+        <w:ind w:left="720" w:hanging="360"/>
       </w:pPr>
       <w:r>
         <w:t xml:space="preserve">Configuration and style maps: </w:t>
@@ -374,6 +408,7 @@
     <w:p>
       <w:pPr>
         <w:pStyle w:val="ListBullet"/>
+        <w:ind w:left="720" w:hanging="360"/>
       </w:pPr>
       <w:r>
         <w:t xml:space="preserve">Strict mode and CI guidance: </w:t>
@@ -390,6 +425,7 @@
     <w:p>
       <w:pPr>
         <w:pStyle w:val="ListBullet"/>
+        <w:ind w:left="720" w:hanging="360"/>
       </w:pPr>
       <w:r>
         <w:t xml:space="preserve">JSON report schema: </w:t>
@@ -406,6 +442,7 @@
     <w:p>
       <w:pPr>
         <w:pStyle w:val="ListBullet"/>
+        <w:ind w:left="720" w:hanging="360"/>
       </w:pPr>
       <w:r>
         <w:t xml:space="preserve">Warning code catalog: </w:t>
@@ -422,6 +459,7 @@
     <w:p>
       <w:pPr>
         <w:pStyle w:val="ListBullet"/>
+        <w:ind w:left="720" w:hanging="360"/>
       </w:pPr>
       <w:r>
         <w:t xml:space="preserve">Release runbook: </w:t>
@@ -438,6 +476,7 @@
     <w:p>
       <w:pPr>
         <w:pStyle w:val="ListBullet"/>
+        <w:ind w:left="720" w:hanging="360"/>
       </w:pPr>
       <w:r>
         <w:t xml:space="preserve">Changelog: </w:t>

</xml_diff>